<commit_message>
Improve MCP image captions and prompts
</commit_message>
<xml_diff>
--- a/LambdaLinker/a.docx
+++ b/LambdaLinker/a.docx
@@ -16,42 +16,563 @@
     </w:p>
     <w:p/>
     <w:p>
-      <w:commentRangeStart w:id="0"/>
-      <w:r>
-        <w:t>现在的目标检测算法在光线好的时候表现都不错，但是一旦到了晚上或者光线很暗的地方，效果就变差了。</w:t>
-      </w:r>
-      <w:commentRangeEnd w:id="0"/>
-      <w:r>
+      <w:pPr>
         <w:rPr>
-          <w:rStyle w:val="a3"/>
+          <w:ins w:id="0" w:author="LuoLi" w:date="2026-01-29T12:52:00Z"/>
         </w:rPr>
-        <w:commentReference w:id="0"/>
-      </w:r>
-      <w:r>
-        <w:t>主要原因是图片太黑，很多特征看不清楚，导致模型识别不到物体。我们想了一个新办法，叫强度域校准（Intensity Domain Calibration）。这其实就是在把图片送进检测网络之前，先调整一下它的像素强度分布。我们在几个数据集上试了一下，发现用了这个方法后，检测准确率确实提高了，而且比之前那个类似的方法（比如 Zero-DCE）要好一些。我们觉得这个方法很有用，能解决实际</w:t>
-      </w:r>
-      <w:commentRangeStart w:id="1"/>
-      <w:commentRangeStart w:id="2"/>
-      <w:r>
-        <w:t>问题</w:t>
-      </w:r>
-      <w:commentRangeEnd w:id="1"/>
+      </w:pPr>
+      <w:ins w:id="1" w:author="LuoLi" w:date="2026-01-29T12:52:00Z">
+        <w:r>
+          <w:t>现在的目标检测算法（像 YOLO 系列或者 R-CNN 那些）在光线好的时候表现都不错，但是在白天能跑得很好的模型，一旦到了晚上或者光线很暗的地方，效果就变差了。</w:t>
+        </w:r>
+        <w:commentRangeStart w:id="2"/>
+        <w:r>
+          <w:t>主要原因是图片太黑，很多特征看不清楚，而且我们发现单纯把图片调亮也不行，</w:t>
+        </w:r>
+        <w:proofErr w:type="gramStart"/>
+        <w:r>
+          <w:t>噪点会</w:t>
+        </w:r>
+        <w:proofErr w:type="gramEnd"/>
+        <w:r>
+          <w:t>变得很大，导致模型识别不到物体，或者把背景看成了物体。</w:t>
+        </w:r>
+      </w:ins>
       <w:commentRangeEnd w:id="2"/>
-      <w:r>
+      <w:ins w:id="3" w:author="LuoLi" w:date="2026-01-29T12:53:00Z">
+        <w:r>
+          <w:rPr>
+            <w:rStyle w:val="a3"/>
+          </w:rPr>
+          <w:commentReference w:id="2"/>
+        </w:r>
+      </w:ins>
+    </w:p>
+    <w:p>
+      <w:pPr>
         <w:rPr>
-          <w:rStyle w:val="a3"/>
+          <w:ins w:id="4" w:author="LuoLi" w:date="2026-01-29T12:52:00Z"/>
         </w:rPr>
-        <w:commentReference w:id="2"/>
-      </w:r>
-      <w:r>
+      </w:pPr>
+      <w:ins w:id="5" w:author="LuoLi" w:date="2026-01-29T12:52:00Z">
+        <w:r>
+          <w:t>针对这个问题，我们想了一个新办法，叫强度域校准（Intensity Domain Calibration）。这其实就是在把图片送进检测网络之前，先调整一下它的像素强度分布，</w:t>
+        </w:r>
+        <w:commentRangeStart w:id="6"/>
+        <w:r>
+          <w:t>有点像</w:t>
+        </w:r>
+        <w:proofErr w:type="gramStart"/>
+        <w:r>
+          <w:t>给图片</w:t>
+        </w:r>
+        <w:proofErr w:type="gramEnd"/>
+        <w:r>
+          <w:t>做了一个自适应的“美颜”，把暗部的细节像拉曲线一样拉出来。</w:t>
+        </w:r>
+      </w:ins>
+      <w:commentRangeEnd w:id="6"/>
+      <w:ins w:id="7" w:author="LuoLi" w:date="2026-01-29T12:53:00Z">
+        <w:r>
+          <w:rPr>
+            <w:rStyle w:val="a3"/>
+          </w:rPr>
+          <w:commentReference w:id="6"/>
+        </w:r>
+      </w:ins>
+      <w:ins w:id="8" w:author="LuoLi" w:date="2026-01-29T12:52:00Z">
+        <w:r>
+          <w:t>我们在几个数据集上试了一下，发现用了这个方法后，检测准确率确实提高了，而且比之前那个类似的方法（比如 Zero-DCE）要好一些。</w:t>
+        </w:r>
+      </w:ins>
+    </w:p>
+    <w:tbl>
+      <w:tblPr>
+        <w:tblW w:w="0" w:type="auto"/>
+        <w:tblCellSpacing w:w="15" w:type="dxa"/>
+        <w:tblCellMar>
+          <w:left w:w="0" w:type="dxa"/>
+          <w:right w:w="0" w:type="dxa"/>
+        </w:tblCellMar>
+        <w:tblLook w:val="04A0" w:firstRow="1" w:lastRow="0" w:firstColumn="1" w:lastColumn="0" w:noHBand="0" w:noVBand="1"/>
+      </w:tblPr>
+      <w:tblGrid>
+        <w:gridCol w:w="2407"/>
+        <w:gridCol w:w="2238"/>
+        <w:gridCol w:w="1443"/>
+      </w:tblGrid>
+      <w:tr>
+        <w:trPr>
+          <w:tblHeader/>
+          <w:tblCellSpacing w:w="15" w:type="dxa"/>
+          <w:ins w:id="9" w:author="LuoLi" w:date="2026-01-29T12:49:00Z"/>
+        </w:trPr>
+        <w:tc>
+          <w:tcPr>
+            <w:tcW w:w="0" w:type="auto"/>
+            <w:tcBorders>
+              <w:top w:val="single" w:sz="6" w:space="0" w:color="auto"/>
+              <w:left w:val="single" w:sz="6" w:space="0" w:color="auto"/>
+              <w:bottom w:val="single" w:sz="6" w:space="0" w:color="auto"/>
+              <w:right w:val="single" w:sz="6" w:space="0" w:color="auto"/>
+            </w:tcBorders>
+            <w:tcMar>
+              <w:top w:w="120" w:type="dxa"/>
+              <w:left w:w="180" w:type="dxa"/>
+              <w:bottom w:w="120" w:type="dxa"/>
+              <w:right w:w="180" w:type="dxa"/>
+            </w:tcMar>
+            <w:vAlign w:val="center"/>
+            <w:hideMark/>
+          </w:tcPr>
+          <w:p>
+            <w:pPr>
+              <w:rPr>
+                <w:ins w:id="10" w:author="LuoLi" w:date="2026-01-29T12:49:00Z"/>
+              </w:rPr>
+            </w:pPr>
+            <w:ins w:id="11" w:author="LuoLi" w:date="2026-01-29T12:49:00Z">
+              <w:r>
+                <w:rPr>
+                  <w:b/>
+                  <w:bCs/>
+                </w:rPr>
+                <w:t>方法名字</w:t>
+              </w:r>
+            </w:ins>
+          </w:p>
+        </w:tc>
+        <w:tc>
+          <w:tcPr>
+            <w:tcW w:w="0" w:type="auto"/>
+            <w:tcBorders>
+              <w:top w:val="single" w:sz="6" w:space="0" w:color="auto"/>
+              <w:left w:val="single" w:sz="6" w:space="0" w:color="auto"/>
+              <w:bottom w:val="single" w:sz="6" w:space="0" w:color="auto"/>
+              <w:right w:val="single" w:sz="6" w:space="0" w:color="auto"/>
+            </w:tcBorders>
+            <w:tcMar>
+              <w:top w:w="120" w:type="dxa"/>
+              <w:left w:w="180" w:type="dxa"/>
+              <w:bottom w:w="120" w:type="dxa"/>
+              <w:right w:w="180" w:type="dxa"/>
+            </w:tcMar>
+            <w:vAlign w:val="center"/>
+            <w:hideMark/>
+          </w:tcPr>
+          <w:p>
+            <w:pPr>
+              <w:rPr>
+                <w:ins w:id="12" w:author="LuoLi" w:date="2026-01-29T12:49:00Z"/>
+              </w:rPr>
+            </w:pPr>
+            <w:proofErr w:type="spellStart"/>
+            <w:ins w:id="13" w:author="LuoLi" w:date="2026-01-29T12:49:00Z">
+              <w:r>
+                <w:rPr>
+                  <w:b/>
+                  <w:bCs/>
+                </w:rPr>
+                <w:t>ExDark</w:t>
+              </w:r>
+              <w:proofErr w:type="spellEnd"/>
+              <w:r>
+                <w:rPr>
+                  <w:b/>
+                  <w:bCs/>
+                </w:rPr>
+                <w:t xml:space="preserve"> 数据集得分</w:t>
+              </w:r>
+            </w:ins>
+          </w:p>
+        </w:tc>
+        <w:tc>
+          <w:tcPr>
+            <w:tcW w:w="0" w:type="auto"/>
+            <w:tcBorders>
+              <w:top w:val="single" w:sz="6" w:space="0" w:color="auto"/>
+              <w:left w:val="single" w:sz="6" w:space="0" w:color="auto"/>
+              <w:bottom w:val="single" w:sz="6" w:space="0" w:color="auto"/>
+              <w:right w:val="single" w:sz="6" w:space="0" w:color="auto"/>
+            </w:tcBorders>
+            <w:tcMar>
+              <w:top w:w="120" w:type="dxa"/>
+              <w:left w:w="180" w:type="dxa"/>
+              <w:bottom w:w="120" w:type="dxa"/>
+              <w:right w:w="180" w:type="dxa"/>
+            </w:tcMar>
+            <w:vAlign w:val="center"/>
+            <w:hideMark/>
+          </w:tcPr>
+          <w:p>
+            <w:pPr>
+              <w:rPr>
+                <w:ins w:id="14" w:author="LuoLi" w:date="2026-01-29T12:49:00Z"/>
+              </w:rPr>
+            </w:pPr>
+            <w:ins w:id="15" w:author="LuoLi" w:date="2026-01-29T12:49:00Z">
+              <w:r>
+                <w:rPr>
+                  <w:b/>
+                  <w:bCs/>
+                </w:rPr>
+                <w:t>速度 (FPS)</w:t>
+              </w:r>
+            </w:ins>
+          </w:p>
+        </w:tc>
+      </w:tr>
+      <w:tr>
+        <w:trPr>
+          <w:tblCellSpacing w:w="15" w:type="dxa"/>
+          <w:ins w:id="16" w:author="LuoLi" w:date="2026-01-29T12:49:00Z"/>
+        </w:trPr>
+        <w:tc>
+          <w:tcPr>
+            <w:tcW w:w="0" w:type="auto"/>
+            <w:tcBorders>
+              <w:top w:val="single" w:sz="6" w:space="0" w:color="auto"/>
+              <w:left w:val="single" w:sz="6" w:space="0" w:color="auto"/>
+              <w:bottom w:val="single" w:sz="6" w:space="0" w:color="auto"/>
+              <w:right w:val="single" w:sz="6" w:space="0" w:color="auto"/>
+            </w:tcBorders>
+            <w:tcMar>
+              <w:top w:w="120" w:type="dxa"/>
+              <w:left w:w="180" w:type="dxa"/>
+              <w:bottom w:w="120" w:type="dxa"/>
+              <w:right w:w="180" w:type="dxa"/>
+            </w:tcMar>
+            <w:vAlign w:val="center"/>
+            <w:hideMark/>
+          </w:tcPr>
+          <w:p>
+            <w:pPr>
+              <w:rPr>
+                <w:ins w:id="17" w:author="LuoLi" w:date="2026-01-29T12:49:00Z"/>
+              </w:rPr>
+            </w:pPr>
+            <w:ins w:id="18" w:author="LuoLi" w:date="2026-01-29T12:49:00Z">
+              <w:r>
+                <w:t>原始 Baseline</w:t>
+              </w:r>
+            </w:ins>
+          </w:p>
+        </w:tc>
+        <w:tc>
+          <w:tcPr>
+            <w:tcW w:w="0" w:type="auto"/>
+            <w:tcBorders>
+              <w:top w:val="single" w:sz="6" w:space="0" w:color="auto"/>
+              <w:left w:val="single" w:sz="6" w:space="0" w:color="auto"/>
+              <w:bottom w:val="single" w:sz="6" w:space="0" w:color="auto"/>
+              <w:right w:val="single" w:sz="6" w:space="0" w:color="auto"/>
+            </w:tcBorders>
+            <w:tcMar>
+              <w:top w:w="120" w:type="dxa"/>
+              <w:left w:w="180" w:type="dxa"/>
+              <w:bottom w:w="120" w:type="dxa"/>
+              <w:right w:w="180" w:type="dxa"/>
+            </w:tcMar>
+            <w:vAlign w:val="center"/>
+            <w:hideMark/>
+          </w:tcPr>
+          <w:p>
+            <w:pPr>
+              <w:rPr>
+                <w:ins w:id="19" w:author="LuoLi" w:date="2026-01-29T12:49:00Z"/>
+              </w:rPr>
+            </w:pPr>
+            <w:ins w:id="20" w:author="LuoLi" w:date="2026-01-29T12:49:00Z">
+              <w:r>
+                <w:t>30.5%</w:t>
+              </w:r>
+            </w:ins>
+          </w:p>
+        </w:tc>
+        <w:tc>
+          <w:tcPr>
+            <w:tcW w:w="0" w:type="auto"/>
+            <w:tcBorders>
+              <w:top w:val="single" w:sz="6" w:space="0" w:color="auto"/>
+              <w:left w:val="single" w:sz="6" w:space="0" w:color="auto"/>
+              <w:bottom w:val="single" w:sz="6" w:space="0" w:color="auto"/>
+              <w:right w:val="single" w:sz="6" w:space="0" w:color="auto"/>
+            </w:tcBorders>
+            <w:tcMar>
+              <w:top w:w="120" w:type="dxa"/>
+              <w:left w:w="180" w:type="dxa"/>
+              <w:bottom w:w="120" w:type="dxa"/>
+              <w:right w:w="180" w:type="dxa"/>
+            </w:tcMar>
+            <w:vAlign w:val="center"/>
+            <w:hideMark/>
+          </w:tcPr>
+          <w:p>
+            <w:pPr>
+              <w:rPr>
+                <w:ins w:id="21" w:author="LuoLi" w:date="2026-01-29T12:49:00Z"/>
+              </w:rPr>
+            </w:pPr>
+            <w:ins w:id="22" w:author="LuoLi" w:date="2026-01-29T12:49:00Z">
+              <w:r>
+                <w:t>45</w:t>
+              </w:r>
+            </w:ins>
+          </w:p>
+        </w:tc>
+      </w:tr>
+      <w:tr>
+        <w:trPr>
+          <w:tblCellSpacing w:w="15" w:type="dxa"/>
+          <w:ins w:id="23" w:author="LuoLi" w:date="2026-01-29T12:49:00Z"/>
+        </w:trPr>
+        <w:tc>
+          <w:tcPr>
+            <w:tcW w:w="0" w:type="auto"/>
+            <w:tcBorders>
+              <w:top w:val="single" w:sz="6" w:space="0" w:color="auto"/>
+              <w:left w:val="single" w:sz="6" w:space="0" w:color="auto"/>
+              <w:bottom w:val="single" w:sz="6" w:space="0" w:color="auto"/>
+              <w:right w:val="single" w:sz="6" w:space="0" w:color="auto"/>
+            </w:tcBorders>
+            <w:tcMar>
+              <w:top w:w="120" w:type="dxa"/>
+              <w:left w:w="180" w:type="dxa"/>
+              <w:bottom w:w="120" w:type="dxa"/>
+              <w:right w:w="180" w:type="dxa"/>
+            </w:tcMar>
+            <w:vAlign w:val="center"/>
+            <w:hideMark/>
+          </w:tcPr>
+          <w:p>
+            <w:pPr>
+              <w:rPr>
+                <w:ins w:id="24" w:author="LuoLi" w:date="2026-01-29T12:49:00Z"/>
+              </w:rPr>
+            </w:pPr>
+            <w:ins w:id="25" w:author="LuoLi" w:date="2026-01-29T12:49:00Z">
+              <w:r>
+                <w:t>对比方法 (Zero-DCE)</w:t>
+              </w:r>
+            </w:ins>
+          </w:p>
+        </w:tc>
+        <w:tc>
+          <w:tcPr>
+            <w:tcW w:w="0" w:type="auto"/>
+            <w:tcBorders>
+              <w:top w:val="single" w:sz="6" w:space="0" w:color="auto"/>
+              <w:left w:val="single" w:sz="6" w:space="0" w:color="auto"/>
+              <w:bottom w:val="single" w:sz="6" w:space="0" w:color="auto"/>
+              <w:right w:val="single" w:sz="6" w:space="0" w:color="auto"/>
+            </w:tcBorders>
+            <w:tcMar>
+              <w:top w:w="120" w:type="dxa"/>
+              <w:left w:w="180" w:type="dxa"/>
+              <w:bottom w:w="120" w:type="dxa"/>
+              <w:right w:w="180" w:type="dxa"/>
+            </w:tcMar>
+            <w:vAlign w:val="center"/>
+            <w:hideMark/>
+          </w:tcPr>
+          <w:p>
+            <w:pPr>
+              <w:rPr>
+                <w:ins w:id="26" w:author="LuoLi" w:date="2026-01-29T12:49:00Z"/>
+              </w:rPr>
+            </w:pPr>
+            <w:ins w:id="27" w:author="LuoLi" w:date="2026-01-29T12:49:00Z">
+              <w:r>
+                <w:t>32.2%</w:t>
+              </w:r>
+            </w:ins>
+          </w:p>
+        </w:tc>
+        <w:tc>
+          <w:tcPr>
+            <w:tcW w:w="0" w:type="auto"/>
+            <w:tcBorders>
+              <w:top w:val="single" w:sz="6" w:space="0" w:color="auto"/>
+              <w:left w:val="single" w:sz="6" w:space="0" w:color="auto"/>
+              <w:bottom w:val="single" w:sz="6" w:space="0" w:color="auto"/>
+              <w:right w:val="single" w:sz="6" w:space="0" w:color="auto"/>
+            </w:tcBorders>
+            <w:tcMar>
+              <w:top w:w="120" w:type="dxa"/>
+              <w:left w:w="180" w:type="dxa"/>
+              <w:bottom w:w="120" w:type="dxa"/>
+              <w:right w:w="180" w:type="dxa"/>
+            </w:tcMar>
+            <w:vAlign w:val="center"/>
+            <w:hideMark/>
+          </w:tcPr>
+          <w:p>
+            <w:pPr>
+              <w:rPr>
+                <w:ins w:id="28" w:author="LuoLi" w:date="2026-01-29T12:49:00Z"/>
+              </w:rPr>
+            </w:pPr>
+            <w:ins w:id="29" w:author="LuoLi" w:date="2026-01-29T12:49:00Z">
+              <w:r>
+                <w:t>30</w:t>
+              </w:r>
+            </w:ins>
+          </w:p>
+        </w:tc>
+      </w:tr>
+      <w:tr>
+        <w:trPr>
+          <w:tblCellSpacing w:w="15" w:type="dxa"/>
+          <w:ins w:id="30" w:author="LuoLi" w:date="2026-01-29T12:49:00Z"/>
+        </w:trPr>
+        <w:tc>
+          <w:tcPr>
+            <w:tcW w:w="0" w:type="auto"/>
+            <w:tcBorders>
+              <w:top w:val="single" w:sz="6" w:space="0" w:color="auto"/>
+              <w:left w:val="single" w:sz="6" w:space="0" w:color="auto"/>
+              <w:bottom w:val="single" w:sz="6" w:space="0" w:color="auto"/>
+              <w:right w:val="single" w:sz="6" w:space="0" w:color="auto"/>
+            </w:tcBorders>
+            <w:tcMar>
+              <w:top w:w="120" w:type="dxa"/>
+              <w:left w:w="180" w:type="dxa"/>
+              <w:bottom w:w="120" w:type="dxa"/>
+              <w:right w:w="180" w:type="dxa"/>
+            </w:tcMar>
+            <w:vAlign w:val="center"/>
+            <w:hideMark/>
+          </w:tcPr>
+          <w:p>
+            <w:pPr>
+              <w:rPr>
+                <w:ins w:id="31" w:author="LuoLi" w:date="2026-01-29T12:49:00Z"/>
+              </w:rPr>
+            </w:pPr>
+            <w:ins w:id="32" w:author="LuoLi" w:date="2026-01-29T12:49:00Z">
+              <w:r>
+                <w:rPr>
+                  <w:b/>
+                  <w:bCs/>
+                </w:rPr>
+                <w:t>我们的方法</w:t>
+              </w:r>
+            </w:ins>
+          </w:p>
+        </w:tc>
+        <w:tc>
+          <w:tcPr>
+            <w:tcW w:w="0" w:type="auto"/>
+            <w:tcBorders>
+              <w:top w:val="single" w:sz="6" w:space="0" w:color="auto"/>
+              <w:left w:val="single" w:sz="6" w:space="0" w:color="auto"/>
+              <w:bottom w:val="single" w:sz="6" w:space="0" w:color="auto"/>
+              <w:right w:val="single" w:sz="6" w:space="0" w:color="auto"/>
+            </w:tcBorders>
+            <w:tcMar>
+              <w:top w:w="120" w:type="dxa"/>
+              <w:left w:w="180" w:type="dxa"/>
+              <w:bottom w:w="120" w:type="dxa"/>
+              <w:right w:w="180" w:type="dxa"/>
+            </w:tcMar>
+            <w:vAlign w:val="center"/>
+            <w:hideMark/>
+          </w:tcPr>
+          <w:p>
+            <w:pPr>
+              <w:rPr>
+                <w:ins w:id="33" w:author="LuoLi" w:date="2026-01-29T12:49:00Z"/>
+              </w:rPr>
+            </w:pPr>
+            <w:ins w:id="34" w:author="LuoLi" w:date="2026-01-29T12:49:00Z">
+              <w:r>
+                <w:rPr>
+                  <w:b/>
+                  <w:bCs/>
+                </w:rPr>
+                <w:t>34.8%</w:t>
+              </w:r>
+            </w:ins>
+          </w:p>
+        </w:tc>
+        <w:tc>
+          <w:tcPr>
+            <w:tcW w:w="0" w:type="auto"/>
+            <w:tcBorders>
+              <w:top w:val="single" w:sz="6" w:space="0" w:color="auto"/>
+              <w:left w:val="single" w:sz="6" w:space="0" w:color="auto"/>
+              <w:bottom w:val="single" w:sz="6" w:space="0" w:color="auto"/>
+              <w:right w:val="single" w:sz="6" w:space="0" w:color="auto"/>
+            </w:tcBorders>
+            <w:tcMar>
+              <w:top w:w="120" w:type="dxa"/>
+              <w:left w:w="180" w:type="dxa"/>
+              <w:bottom w:w="120" w:type="dxa"/>
+              <w:right w:w="180" w:type="dxa"/>
+            </w:tcMar>
+            <w:vAlign w:val="center"/>
+            <w:hideMark/>
+          </w:tcPr>
+          <w:p>
+            <w:pPr>
+              <w:rPr>
+                <w:ins w:id="35" w:author="LuoLi" w:date="2026-01-29T12:49:00Z"/>
+              </w:rPr>
+            </w:pPr>
+            <w:ins w:id="36" w:author="LuoLi" w:date="2026-01-29T12:49:00Z">
+              <w:r>
+                <w:rPr>
+                  <w:b/>
+                  <w:bCs/>
+                </w:rPr>
+                <w:t>42</w:t>
+              </w:r>
+            </w:ins>
+          </w:p>
+        </w:tc>
+      </w:tr>
+    </w:tbl>
+    <w:p>
+      <w:pPr>
         <w:rPr>
-          <w:rStyle w:val="a3"/>
+          <w:ins w:id="37" w:author="LuoLi" w:date="2026-01-29T12:45:00Z"/>
         </w:rPr>
-        <w:commentReference w:id="1"/>
-      </w:r>
-      <w:r>
-        <w:t>。</w:t>
-      </w:r>
+      </w:pPr>
+    </w:p>
+    <w:p>
+      <w:commentRangeStart w:id="38"/>
+      <w:ins w:id="39" w:author="LuoLi" w:date="2026-01-29T12:52:00Z">
+        <w:r>
+          <w:rPr>
+            <w:rFonts w:hint="eastAsia"/>
+          </w:rPr>
+          <w:t>虽然我们的速度比原始版本慢了一丢</w:t>
+        </w:r>
+        <w:proofErr w:type="gramStart"/>
+        <w:r>
+          <w:rPr>
+            <w:rFonts w:hint="eastAsia"/>
+          </w:rPr>
+          <w:t>丢</w:t>
+        </w:r>
+        <w:commentRangeEnd w:id="38"/>
+        <w:proofErr w:type="gramEnd"/>
+        <w:r>
+          <w:rPr>
+            <w:rStyle w:val="a3"/>
+          </w:rPr>
+          <w:commentReference w:id="38"/>
+        </w:r>
+        <w:r>
+          <w:rPr>
+            <w:rFonts w:hint="eastAsia"/>
+          </w:rPr>
+          <w:t>（少了</w:t>
+        </w:r>
+        <w:r>
+          <w:t>3帧），但是比 Zero-DCE 快多了。我们觉得这个方法很有用，能解决实际问题，下一步我们打算把这个东西部署到那种夜视监控摄像头上去试试，感觉应该挺有搞头的。</w:t>
+        </w:r>
+      </w:ins>
     </w:p>
     <w:sectPr>
       <w:pgSz w:w="11906" w:h="16838"/>
@@ -65,13 +586,48 @@
 
 <file path=word/comments.xml><?xml version="1.0" encoding="utf-8"?>
 <w:comments xmlns:wpc="http://schemas.microsoft.com/office/word/2010/wordprocessingCanvas" xmlns:cx="http://schemas.microsoft.com/office/drawing/2014/chartex" xmlns:cx1="http://schemas.microsoft.com/office/drawing/2015/9/8/chartex" xmlns:cx2="http://schemas.microsoft.com/office/drawing/2015/10/21/chartex" xmlns:cx3="http://schemas.microsoft.com/office/drawing/2016/5/9/chartex" xmlns:cx4="http://schemas.microsoft.com/office/drawing/2016/5/10/chartex" xmlns:cx5="http://schemas.microsoft.com/office/drawing/2016/5/11/chartex" xmlns:cx6="http://schemas.microsoft.com/office/drawing/2016/5/12/chartex" xmlns:cx7="http://schemas.microsoft.com/office/drawing/2016/5/13/chartex" xmlns:cx8="http://schemas.microsoft.com/office/drawing/2016/5/14/chartex" xmlns:mc="http://schemas.openxmlformats.org/markup-compatibility/2006" xmlns:aink="http://schemas.microsoft.com/office/drawing/2016/ink" xmlns:am3d="http://schemas.microsoft.com/office/drawing/2017/model3d" xmlns:o="urn:schemas-microsoft-com:office:office" xmlns:r="http://schemas.openxmlformats.org/officeDocument/2006/relationships" xmlns:m="http://schemas.openxmlformats.org/officeDocument/2006/math" xmlns:v="urn:schemas-microsoft-com:vml" xmlns:wp14="http://schemas.microsoft.com/office/word/2010/wordprocessingDrawing" xmlns:wp="http://schemas.openxmlformats.org/drawingml/2006/wordprocessingDrawing" xmlns:w10="urn:schemas-microsoft-com:office:word" xmlns:w="http://schemas.openxmlformats.org/wordprocessingml/2006/main" xmlns:w14="http://schemas.microsoft.com/office/word/2010/wordml" xmlns:w15="http://schemas.microsoft.com/office/word/2012/wordml" xmlns:w16cex="http://schemas.microsoft.com/office/word/2018/wordml/cex" xmlns:w16cid="http://schemas.microsoft.com/office/word/2016/wordml/cid" xmlns:w16="http://schemas.microsoft.com/office/word/2018/wordml" xmlns:w16sdtdh="http://schemas.microsoft.com/office/word/2020/wordml/sdtdatahash" xmlns:w16se="http://schemas.microsoft.com/office/word/2015/wordml/symex" xmlns:wpg="http://schemas.microsoft.com/office/word/2010/wordprocessingGroup" xmlns:wpi="http://schemas.microsoft.com/office/word/2010/wordprocessingInk" xmlns:wne="http://schemas.microsoft.com/office/word/2006/wordml" xmlns:wps="http://schemas.microsoft.com/office/word/2010/wordprocessingShape" mc:Ignorable="w14 w15 w16se w16cid w16 w16cex w16sdtdh wp14">
-  <w:comment w:id="0" w:author="LuoLi" w:date="2026-01-28T16:00:00Z" w:initials="L">
+  <w:comment w:id="2" w:author="LuoLi" w:date="2026-01-29T12:53:00Z" w:initials="L">
     <w:p>
       <w:pPr>
         <w:pStyle w:val="a4"/>
+      </w:pPr>
+      <w:r>
+        <w:rPr>
+          <w:rStyle w:val="a3"/>
+        </w:rPr>
+        <w:annotationRef/>
+      </w:r>
+      <w:r>
         <w:rPr>
           <w:rFonts w:hint="eastAsia"/>
         </w:rPr>
+        <w:t>分析不够深入</w:t>
+      </w:r>
+    </w:p>
+  </w:comment>
+  <w:comment w:id="6" w:author="LuoLi" w:date="2026-01-29T12:53:00Z" w:initials="L">
+    <w:p>
+      <w:pPr>
+        <w:pStyle w:val="a4"/>
+      </w:pPr>
+      <w:r>
+        <w:rPr>
+          <w:rStyle w:val="a3"/>
+        </w:rPr>
+        <w:annotationRef/>
+      </w:r>
+      <w:r>
+        <w:rPr>
+          <w:rFonts w:hint="eastAsia"/>
+        </w:rPr>
+        <w:t>增加叙述细节</w:t>
+      </w:r>
+    </w:p>
+  </w:comment>
+  <w:comment w:id="38" w:author="LuoLi" w:date="2026-01-29T12:52:00Z" w:initials="L">
+    <w:p>
+      <w:pPr>
+        <w:pStyle w:val="a4"/>
       </w:pPr>
       <w:r>
         <w:rPr>
@@ -87,67 +643,69 @@
       </w:r>
     </w:p>
   </w:comment>
-  <w:comment w:id="2" w:author="LuoLi" w:date="2026-01-28T16:00:00Z" w:initials="L">
-    <w:p>
-      <w:pPr>
-        <w:pStyle w:val="a4"/>
-      </w:pPr>
-      <w:r>
-        <w:rPr>
-          <w:rStyle w:val="a3"/>
-          <w:rFonts w:hint="eastAsia"/>
-        </w:rPr>
-        <w:t>太长了</w:t>
-      </w:r>
-    </w:p>
-  </w:comment>
-  <w:comment w:id="1" w:author="LuoLi" w:date="2026-01-28T15:59:00Z" w:initials="L">
-    <w:p>
-      <w:pPr>
-        <w:pStyle w:val="a4"/>
-        <w:rPr>
-          <w:rFonts w:hint="eastAsia"/>
-        </w:rPr>
-      </w:pPr>
-      <w:r>
-        <w:rPr>
-          <w:rStyle w:val="a3"/>
-        </w:rPr>
-        <w:annotationRef/>
-      </w:r>
-      <w:r>
-        <w:rPr>
-          <w:rFonts w:hint="eastAsia"/>
-        </w:rPr>
-        <w:t>不够学术</w:t>
-      </w:r>
-    </w:p>
-  </w:comment>
 </w:comments>
 </file>
 
 <file path=word/commentsExtended.xml><?xml version="1.0" encoding="utf-8"?>
 <w15:commentsEx xmlns:wpc="http://schemas.microsoft.com/office/word/2010/wordprocessingCanvas" xmlns:cx="http://schemas.microsoft.com/office/drawing/2014/chartex" xmlns:cx1="http://schemas.microsoft.com/office/drawing/2015/9/8/chartex" xmlns:cx2="http://schemas.microsoft.com/office/drawing/2015/10/21/chartex" xmlns:cx3="http://schemas.microsoft.com/office/drawing/2016/5/9/chartex" xmlns:cx4="http://schemas.microsoft.com/office/drawing/2016/5/10/chartex" xmlns:cx5="http://schemas.microsoft.com/office/drawing/2016/5/11/chartex" xmlns:cx6="http://schemas.microsoft.com/office/drawing/2016/5/12/chartex" xmlns:cx7="http://schemas.microsoft.com/office/drawing/2016/5/13/chartex" xmlns:cx8="http://schemas.microsoft.com/office/drawing/2016/5/14/chartex" xmlns:mc="http://schemas.openxmlformats.org/markup-compatibility/2006" xmlns:aink="http://schemas.microsoft.com/office/drawing/2016/ink" xmlns:am3d="http://schemas.microsoft.com/office/drawing/2017/model3d" xmlns:o="urn:schemas-microsoft-com:office:office" xmlns:r="http://schemas.openxmlformats.org/officeDocument/2006/relationships" xmlns:m="http://schemas.openxmlformats.org/officeDocument/2006/math" xmlns:v="urn:schemas-microsoft-com:vml" xmlns:wp14="http://schemas.microsoft.com/office/word/2010/wordprocessingDrawing" xmlns:wp="http://schemas.openxmlformats.org/drawingml/2006/wordprocessingDrawing" xmlns:w10="urn:schemas-microsoft-com:office:word" xmlns:w="http://schemas.openxmlformats.org/wordprocessingml/2006/main" xmlns:w14="http://schemas.microsoft.com/office/word/2010/wordml" xmlns:w15="http://schemas.microsoft.com/office/word/2012/wordml" xmlns:w16cex="http://schemas.microsoft.com/office/word/2018/wordml/cex" xmlns:w16cid="http://schemas.microsoft.com/office/word/2016/wordml/cid" xmlns:w16="http://schemas.microsoft.com/office/word/2018/wordml" xmlns:w16sdtdh="http://schemas.microsoft.com/office/word/2020/wordml/sdtdatahash" xmlns:w16se="http://schemas.microsoft.com/office/word/2015/wordml/symex" xmlns:wpg="http://schemas.microsoft.com/office/word/2010/wordprocessingGroup" xmlns:wpi="http://schemas.microsoft.com/office/word/2010/wordprocessingInk" xmlns:wne="http://schemas.microsoft.com/office/word/2006/wordml" xmlns:wps="http://schemas.microsoft.com/office/word/2010/wordprocessingShape" mc:Ignorable="w14 w15 w16se w16cid w16 w16cex w16sdtdh wp14">
-  <w15:commentEx w15:paraId="7985B97A" w15:done="0"/>
-  <w15:commentEx w15:paraId="38705E90" w15:done="0"/>
-  <w15:commentEx w15:paraId="0DCC62A1" w15:done="0"/>
+  <w15:commentEx w15:paraId="09757BC6" w15:done="0"/>
+  <w15:commentEx w15:paraId="45D4F558" w15:done="0"/>
+  <w15:commentEx w15:paraId="132FF27B" w15:done="0"/>
 </w15:commentsEx>
 </file>
 
 <file path=word/commentsExtensible.xml><?xml version="1.0" encoding="utf-8"?>
 <w16cex:commentsExtensible xmlns:wpc="http://schemas.microsoft.com/office/word/2010/wordprocessingCanvas" xmlns:cx="http://schemas.microsoft.com/office/drawing/2014/chartex" xmlns:cx1="http://schemas.microsoft.com/office/drawing/2015/9/8/chartex" xmlns:cx2="http://schemas.microsoft.com/office/drawing/2015/10/21/chartex" xmlns:cx3="http://schemas.microsoft.com/office/drawing/2016/5/9/chartex" xmlns:cx4="http://schemas.microsoft.com/office/drawing/2016/5/10/chartex" xmlns:cx5="http://schemas.microsoft.com/office/drawing/2016/5/11/chartex" xmlns:cx6="http://schemas.microsoft.com/office/drawing/2016/5/12/chartex" xmlns:cx7="http://schemas.microsoft.com/office/drawing/2016/5/13/chartex" xmlns:cx8="http://schemas.microsoft.com/office/drawing/2016/5/14/chartex" xmlns:mc="http://schemas.openxmlformats.org/markup-compatibility/2006" xmlns:aink="http://schemas.microsoft.com/office/drawing/2016/ink" xmlns:am3d="http://schemas.microsoft.com/office/drawing/2017/model3d" xmlns:o="urn:schemas-microsoft-com:office:office" xmlns:r="http://schemas.openxmlformats.org/officeDocument/2006/relationships" xmlns:m="http://schemas.openxmlformats.org/officeDocument/2006/math" xmlns:v="urn:schemas-microsoft-com:vml" xmlns:wp14="http://schemas.microsoft.com/office/word/2010/wordprocessingDrawing" xmlns:wp="http://schemas.openxmlformats.org/drawingml/2006/wordprocessingDrawing" xmlns:w10="urn:schemas-microsoft-com:office:word" xmlns:w="http://schemas.openxmlformats.org/wordprocessingml/2006/main" xmlns:w14="http://schemas.microsoft.com/office/word/2010/wordml" xmlns:w15="http://schemas.microsoft.com/office/word/2012/wordml" xmlns:w16cex="http://schemas.microsoft.com/office/word/2018/wordml/cex" xmlns:w16cid="http://schemas.microsoft.com/office/word/2016/wordml/cid" xmlns:w16="http://schemas.microsoft.com/office/word/2018/wordml" xmlns:w16sdtdh="http://schemas.microsoft.com/office/word/2020/wordml/sdtdatahash" xmlns:w16se="http://schemas.microsoft.com/office/word/2015/wordml/symex" xmlns:wpg="http://schemas.microsoft.com/office/word/2010/wordprocessingGroup" xmlns:wpi="http://schemas.microsoft.com/office/word/2010/wordprocessingInk" xmlns:wne="http://schemas.microsoft.com/office/word/2006/wordml" xmlns:wps="http://schemas.microsoft.com/office/word/2010/wordprocessingShape" mc:Ignorable="w14 w15 w16se w16cid w16 w16cex w16sdtdh wp14">
-  <w16cex:commentExtensible w16cex:durableId="2D24B10E" w16cex:dateUtc="2026-01-28T08:00:00Z"/>
-  <w16cex:commentExtensible w16cex:durableId="2D24B102" w16cex:dateUtc="2026-01-28T08:00:00Z"/>
-  <w16cex:commentExtensible w16cex:durableId="2D24B0D1" w16cex:dateUtc="2026-01-28T07:59:00Z"/>
+  <w16cex:commentExtensible w16cex:durableId="2D25D6DE" w16cex:dateUtc="2026-01-29T04:53:00Z"/>
+  <w16cex:commentExtensible w16cex:durableId="2D25D6CB" w16cex:dateUtc="2026-01-29T04:53:00Z"/>
+  <w16cex:commentExtensible w16cex:durableId="2D25D6AB" w16cex:dateUtc="2026-01-29T04:52:00Z"/>
 </w16cex:commentsExtensible>
 </file>
 
 <file path=word/commentsIds.xml><?xml version="1.0" encoding="utf-8"?>
 <w16cid:commentsIds xmlns:wpc="http://schemas.microsoft.com/office/word/2010/wordprocessingCanvas" xmlns:cx="http://schemas.microsoft.com/office/drawing/2014/chartex" xmlns:cx1="http://schemas.microsoft.com/office/drawing/2015/9/8/chartex" xmlns:cx2="http://schemas.microsoft.com/office/drawing/2015/10/21/chartex" xmlns:cx3="http://schemas.microsoft.com/office/drawing/2016/5/9/chartex" xmlns:cx4="http://schemas.microsoft.com/office/drawing/2016/5/10/chartex" xmlns:cx5="http://schemas.microsoft.com/office/drawing/2016/5/11/chartex" xmlns:cx6="http://schemas.microsoft.com/office/drawing/2016/5/12/chartex" xmlns:cx7="http://schemas.microsoft.com/office/drawing/2016/5/13/chartex" xmlns:cx8="http://schemas.microsoft.com/office/drawing/2016/5/14/chartex" xmlns:mc="http://schemas.openxmlformats.org/markup-compatibility/2006" xmlns:aink="http://schemas.microsoft.com/office/drawing/2016/ink" xmlns:am3d="http://schemas.microsoft.com/office/drawing/2017/model3d" xmlns:o="urn:schemas-microsoft-com:office:office" xmlns:r="http://schemas.openxmlformats.org/officeDocument/2006/relationships" xmlns:m="http://schemas.openxmlformats.org/officeDocument/2006/math" xmlns:v="urn:schemas-microsoft-com:vml" xmlns:wp14="http://schemas.microsoft.com/office/word/2010/wordprocessingDrawing" xmlns:wp="http://schemas.openxmlformats.org/drawingml/2006/wordprocessingDrawing" xmlns:w10="urn:schemas-microsoft-com:office:word" xmlns:w="http://schemas.openxmlformats.org/wordprocessingml/2006/main" xmlns:w14="http://schemas.microsoft.com/office/word/2010/wordml" xmlns:w15="http://schemas.microsoft.com/office/word/2012/wordml" xmlns:w16cex="http://schemas.microsoft.com/office/word/2018/wordml/cex" xmlns:w16cid="http://schemas.microsoft.com/office/word/2016/wordml/cid" xmlns:w16="http://schemas.microsoft.com/office/word/2018/wordml" xmlns:w16sdtdh="http://schemas.microsoft.com/office/word/2020/wordml/sdtdatahash" xmlns:w16se="http://schemas.microsoft.com/office/word/2015/wordml/symex" xmlns:wpg="http://schemas.microsoft.com/office/word/2010/wordprocessingGroup" xmlns:wpi="http://schemas.microsoft.com/office/word/2010/wordprocessingInk" xmlns:wne="http://schemas.microsoft.com/office/word/2006/wordml" xmlns:wps="http://schemas.microsoft.com/office/word/2010/wordprocessingShape" mc:Ignorable="w14 w15 w16se w16cid w16 w16cex w16sdtdh wp14">
-  <w16cid:commentId w16cid:paraId="7985B97A" w16cid:durableId="2D24B10E"/>
-  <w16cid:commentId w16cid:paraId="38705E90" w16cid:durableId="2D24B102"/>
-  <w16cid:commentId w16cid:paraId="0DCC62A1" w16cid:durableId="2D24B0D1"/>
+  <w16cid:commentId w16cid:paraId="09757BC6" w16cid:durableId="2D25D6DE"/>
+  <w16cid:commentId w16cid:paraId="45D4F558" w16cid:durableId="2D25D6CB"/>
+  <w16cid:commentId w16cid:paraId="132FF27B" w16cid:durableId="2D25D6AB"/>
 </w16cid:commentsIds>
+</file>
+
+<file path=word/endnotes.xml><?xml version="1.0" encoding="utf-8"?>
+<w:endnotes xmlns:wpc="http://schemas.microsoft.com/office/word/2010/wordprocessingCanvas" xmlns:cx="http://schemas.microsoft.com/office/drawing/2014/chartex" xmlns:cx1="http://schemas.microsoft.com/office/drawing/2015/9/8/chartex" xmlns:cx2="http://schemas.microsoft.com/office/drawing/2015/10/21/chartex" xmlns:cx3="http://schemas.microsoft.com/office/drawing/2016/5/9/chartex" xmlns:cx4="http://schemas.microsoft.com/office/drawing/2016/5/10/chartex" xmlns:cx5="http://schemas.microsoft.com/office/drawing/2016/5/11/chartex" xmlns:cx6="http://schemas.microsoft.com/office/drawing/2016/5/12/chartex" xmlns:cx7="http://schemas.microsoft.com/office/drawing/2016/5/13/chartex" xmlns:cx8="http://schemas.microsoft.com/office/drawing/2016/5/14/chartex" xmlns:mc="http://schemas.openxmlformats.org/markup-compatibility/2006" xmlns:aink="http://schemas.microsoft.com/office/drawing/2016/ink" xmlns:am3d="http://schemas.microsoft.com/office/drawing/2017/model3d" xmlns:o="urn:schemas-microsoft-com:office:office" xmlns:r="http://schemas.openxmlformats.org/officeDocument/2006/relationships" xmlns:m="http://schemas.openxmlformats.org/officeDocument/2006/math" xmlns:v="urn:schemas-microsoft-com:vml" xmlns:wp14="http://schemas.microsoft.com/office/word/2010/wordprocessingDrawing" xmlns:wp="http://schemas.openxmlformats.org/drawingml/2006/wordprocessingDrawing" xmlns:w10="urn:schemas-microsoft-com:office:word" xmlns:w="http://schemas.openxmlformats.org/wordprocessingml/2006/main" xmlns:w14="http://schemas.microsoft.com/office/word/2010/wordml" xmlns:w15="http://schemas.microsoft.com/office/word/2012/wordml" xmlns:w16cex="http://schemas.microsoft.com/office/word/2018/wordml/cex" xmlns:w16cid="http://schemas.microsoft.com/office/word/2016/wordml/cid" xmlns:w16="http://schemas.microsoft.com/office/word/2018/wordml" xmlns:w16sdtdh="http://schemas.microsoft.com/office/word/2020/wordml/sdtdatahash" xmlns:w16se="http://schemas.microsoft.com/office/word/2015/wordml/symex" xmlns:wpg="http://schemas.microsoft.com/office/word/2010/wordprocessingGroup" xmlns:wpi="http://schemas.microsoft.com/office/word/2010/wordprocessingInk" xmlns:wne="http://schemas.microsoft.com/office/word/2006/wordml" xmlns:wps="http://schemas.microsoft.com/office/word/2010/wordprocessingShape" mc:Ignorable="w14 w15 w16se w16cid w16 w16cex w16sdtdh wp14">
+  <w:endnote w:type="separator" w:id="-1">
+    <w:p>
+      <w:r>
+        <w:separator/>
+      </w:r>
+    </w:p>
+  </w:endnote>
+  <w:endnote w:type="continuationSeparator" w:id="0">
+    <w:p>
+      <w:r>
+        <w:continuationSeparator/>
+      </w:r>
+    </w:p>
+  </w:endnote>
+</w:endnotes>
+</file>
+
+<file path=word/footnotes.xml><?xml version="1.0" encoding="utf-8"?>
+<w:footnotes xmlns:wpc="http://schemas.microsoft.com/office/word/2010/wordprocessingCanvas" xmlns:cx="http://schemas.microsoft.com/office/drawing/2014/chartex" xmlns:cx1="http://schemas.microsoft.com/office/drawing/2015/9/8/chartex" xmlns:cx2="http://schemas.microsoft.com/office/drawing/2015/10/21/chartex" xmlns:cx3="http://schemas.microsoft.com/office/drawing/2016/5/9/chartex" xmlns:cx4="http://schemas.microsoft.com/office/drawing/2016/5/10/chartex" xmlns:cx5="http://schemas.microsoft.com/office/drawing/2016/5/11/chartex" xmlns:cx6="http://schemas.microsoft.com/office/drawing/2016/5/12/chartex" xmlns:cx7="http://schemas.microsoft.com/office/drawing/2016/5/13/chartex" xmlns:cx8="http://schemas.microsoft.com/office/drawing/2016/5/14/chartex" xmlns:mc="http://schemas.openxmlformats.org/markup-compatibility/2006" xmlns:aink="http://schemas.microsoft.com/office/drawing/2016/ink" xmlns:am3d="http://schemas.microsoft.com/office/drawing/2017/model3d" xmlns:o="urn:schemas-microsoft-com:office:office" xmlns:r="http://schemas.openxmlformats.org/officeDocument/2006/relationships" xmlns:m="http://schemas.openxmlformats.org/officeDocument/2006/math" xmlns:v="urn:schemas-microsoft-com:vml" xmlns:wp14="http://schemas.microsoft.com/office/word/2010/wordprocessingDrawing" xmlns:wp="http://schemas.openxmlformats.org/drawingml/2006/wordprocessingDrawing" xmlns:w10="urn:schemas-microsoft-com:office:word" xmlns:w="http://schemas.openxmlformats.org/wordprocessingml/2006/main" xmlns:w14="http://schemas.microsoft.com/office/word/2010/wordml" xmlns:w15="http://schemas.microsoft.com/office/word/2012/wordml" xmlns:w16cex="http://schemas.microsoft.com/office/word/2018/wordml/cex" xmlns:w16cid="http://schemas.microsoft.com/office/word/2016/wordml/cid" xmlns:w16="http://schemas.microsoft.com/office/word/2018/wordml" xmlns:w16sdtdh="http://schemas.microsoft.com/office/word/2020/wordml/sdtdatahash" xmlns:w16se="http://schemas.microsoft.com/office/word/2015/wordml/symex" xmlns:wpg="http://schemas.microsoft.com/office/word/2010/wordprocessingGroup" xmlns:wpi="http://schemas.microsoft.com/office/word/2010/wordprocessingInk" xmlns:wne="http://schemas.microsoft.com/office/word/2006/wordml" xmlns:wps="http://schemas.microsoft.com/office/word/2010/wordprocessingShape" mc:Ignorable="w14 w15 w16se w16cid w16 w16cex w16sdtdh wp14">
+  <w:footnote w:type="separator" w:id="-1">
+    <w:p>
+      <w:r>
+        <w:separator/>
+      </w:r>
+    </w:p>
+  </w:footnote>
+  <w:footnote w:type="continuationSeparator" w:id="0">
+    <w:p>
+      <w:r>
+        <w:continuationSeparator/>
+      </w:r>
+    </w:p>
+  </w:footnote>
+</w:footnotes>
 </file>
 
 <file path=word/people.xml><?xml version="1.0" encoding="utf-8"?>
@@ -584,7 +1142,6 @@
   <w:style w:type="character" w:default="1" w:styleId="a0">
     <w:name w:val="Default Paragraph Font"/>
     <w:uiPriority w:val="1"/>
-    <w:semiHidden/>
     <w:unhideWhenUsed/>
   </w:style>
   <w:style w:type="table" w:default="1" w:styleId="a1">
@@ -678,6 +1235,87 @@
     <w:rPr>
       <w:b/>
       <w:bCs/>
+    </w:rPr>
+  </w:style>
+  <w:style w:type="table" w:styleId="a8">
+    <w:name w:val="Table Grid"/>
+    <w:basedOn w:val="a1"/>
+    <w:uiPriority w:val="39"/>
+    <w:rsid w:val="00634A0B"/>
+    <w:tblPr>
+      <w:tblBorders>
+        <w:top w:val="single" w:sz="4" w:space="0" w:color="auto"/>
+        <w:left w:val="single" w:sz="4" w:space="0" w:color="auto"/>
+        <w:bottom w:val="single" w:sz="4" w:space="0" w:color="auto"/>
+        <w:right w:val="single" w:sz="4" w:space="0" w:color="auto"/>
+        <w:insideH w:val="single" w:sz="4" w:space="0" w:color="auto"/>
+        <w:insideV w:val="single" w:sz="4" w:space="0" w:color="auto"/>
+      </w:tblBorders>
+    </w:tblPr>
+  </w:style>
+  <w:style w:type="paragraph" w:styleId="a9">
+    <w:name w:val="header"/>
+    <w:basedOn w:val="a"/>
+    <w:link w:val="aa"/>
+    <w:uiPriority w:val="99"/>
+    <w:unhideWhenUsed/>
+    <w:rsid w:val="00DC2367"/>
+    <w:pPr>
+      <w:pBdr>
+        <w:bottom w:val="single" w:sz="6" w:space="1" w:color="auto"/>
+      </w:pBdr>
+      <w:tabs>
+        <w:tab w:val="center" w:pos="4153"/>
+        <w:tab w:val="right" w:pos="8306"/>
+      </w:tabs>
+      <w:snapToGrid w:val="0"/>
+      <w:jc w:val="center"/>
+    </w:pPr>
+    <w:rPr>
+      <w:sz w:val="18"/>
+      <w:szCs w:val="18"/>
+    </w:rPr>
+  </w:style>
+  <w:style w:type="character" w:customStyle="1" w:styleId="aa">
+    <w:name w:val="页眉 字符"/>
+    <w:basedOn w:val="a0"/>
+    <w:link w:val="a9"/>
+    <w:uiPriority w:val="99"/>
+    <w:rsid w:val="00DC2367"/>
+    <w:rPr>
+      <w:sz w:val="18"/>
+      <w:szCs w:val="18"/>
+    </w:rPr>
+  </w:style>
+  <w:style w:type="paragraph" w:styleId="ab">
+    <w:name w:val="footer"/>
+    <w:basedOn w:val="a"/>
+    <w:link w:val="ac"/>
+    <w:uiPriority w:val="99"/>
+    <w:unhideWhenUsed/>
+    <w:rsid w:val="00DC2367"/>
+    <w:pPr>
+      <w:tabs>
+        <w:tab w:val="center" w:pos="4153"/>
+        <w:tab w:val="right" w:pos="8306"/>
+      </w:tabs>
+      <w:snapToGrid w:val="0"/>
+      <w:jc w:val="left"/>
+    </w:pPr>
+    <w:rPr>
+      <w:sz w:val="18"/>
+      <w:szCs w:val="18"/>
+    </w:rPr>
+  </w:style>
+  <w:style w:type="character" w:customStyle="1" w:styleId="ac">
+    <w:name w:val="页脚 字符"/>
+    <w:basedOn w:val="a0"/>
+    <w:link w:val="ab"/>
+    <w:uiPriority w:val="99"/>
+    <w:rsid w:val="00DC2367"/>
+    <w:rPr>
+      <w:sz w:val="18"/>
+      <w:szCs w:val="18"/>
     </w:rPr>
   </w:style>
 </w:styles>

</xml_diff>